<commit_message>
Fixing incorrect fields with _c_c suffix via claude and cli.
</commit_message>
<xml_diff>
--- a/Mortgage Center Program/Setup/REVIEW-LOG.docx
+++ b/Mortgage Center Program/Setup/REVIEW-LOG.docx
@@ -31731,6 +31731,759 @@
       <w:pPr>
         <w:spacing w:after="120"/>
       </w:pPr>
+    </w:p>
+    <w:p>
+      <w:pPr>
+        <w:pStyle w:val="Heading2"/>
+      </w:pPr>
+      <w:r>
+        <w:t xml:space="preserve">8.8 Live org build check, Project 03 (October 25, 2026)</w:t>
+      </w:r>
+    </w:p>
+    <w:p>
+      <w:pPr>
+        <w:spacing w:after="120"/>
+      </w:pPr>
+      <w:r>
+        <w:t xml:space="preserve">The data model was clicked into a Developer Edition org, retrieved and compared field by field against </w:t>
+      </w:r>
+      <w:r>
+        <w:rPr>
+          <w:rFonts w:ascii="Consolas" w:cs="Consolas" w:eastAsia="Consolas" w:hAnsi="Consolas"/>
+          <w:sz w:val="19"/>
+          <w:szCs w:val="19"/>
+          <w:shd w:fill="EEF0F3" w:color="auto" w:val="clear"/>
+        </w:rPr>
+        <w:t xml:space="preserve">code/03-data-model/datamodel.py</w:t>
+      </w:r>
+      <w:r>
+        <w:t xml:space="preserve">, then repaired through the Salesforce DX MCP server.</w:t>
+      </w:r>
+    </w:p>
+    <w:tbl>
+      <w:tblPr>
+        <w:tblW w:type="dxa" w:w="10080"/>
+        <w:tblBorders>
+          <w:top w:val="single" w:color="auto" w:sz="4"/>
+          <w:left w:val="single" w:color="auto" w:sz="4"/>
+          <w:bottom w:val="single" w:color="auto" w:sz="4"/>
+          <w:right w:val="single" w:color="auto" w:sz="4"/>
+          <w:insideH w:val="single" w:color="auto" w:sz="4"/>
+          <w:insideV w:val="single" w:color="auto" w:sz="4"/>
+        </w:tblBorders>
+      </w:tblPr>
+      <w:tblGrid>
+        <w:gridCol w:w="5051"/>
+        <w:gridCol w:w="5029"/>
+      </w:tblGrid>
+      <w:tr>
+        <w:trPr>
+          <w:cantSplit/>
+          <w:tblHeader/>
+        </w:trPr>
+        <w:tc>
+          <w:tcPr>
+            <w:tcW w:type="dxa" w:w="5051"/>
+            <w:tcBorders>
+              <w:top w:val="single" w:color="BFBFBF" w:sz="4"/>
+              <w:left w:val="single" w:color="BFBFBF" w:sz="4"/>
+              <w:bottom w:val="single" w:color="BFBFBF" w:sz="4"/>
+              <w:right w:val="single" w:color="BFBFBF" w:sz="4"/>
+            </w:tcBorders>
+            <w:shd w:fill="1F3864" w:color="auto" w:val="clear"/>
+            <w:tcMar>
+              <w:top w:type="dxa" w:w="50"/>
+              <w:left w:type="dxa" w:w="80"/>
+              <w:bottom w:type="dxa" w:w="50"/>
+              <w:right w:type="dxa" w:w="80"/>
+            </w:tcMar>
+          </w:tcPr>
+          <w:p>
+            <w:pPr>
+              <w:spacing w:after="0"/>
+            </w:pPr>
+            <w:r>
+              <w:rPr>
+                <w:b/>
+                <w:bCs/>
+                <w:color w:val="FFFFFF"/>
+                <w:sz w:val="17"/>
+                <w:szCs w:val="17"/>
+              </w:rPr>
+              <w:t xml:space="preserve">Finding</w:t>
+            </w:r>
+          </w:p>
+        </w:tc>
+        <w:tc>
+          <w:tcPr>
+            <w:tcW w:type="dxa" w:w="5029"/>
+            <w:tcBorders>
+              <w:top w:val="single" w:color="BFBFBF" w:sz="4"/>
+              <w:left w:val="single" w:color="BFBFBF" w:sz="4"/>
+              <w:bottom w:val="single" w:color="BFBFBF" w:sz="4"/>
+              <w:right w:val="single" w:color="BFBFBF" w:sz="4"/>
+            </w:tcBorders>
+            <w:shd w:fill="1F3864" w:color="auto" w:val="clear"/>
+            <w:tcMar>
+              <w:top w:type="dxa" w:w="50"/>
+              <w:left w:type="dxa" w:w="80"/>
+              <w:bottom w:type="dxa" w:w="50"/>
+              <w:right w:type="dxa" w:w="80"/>
+            </w:tcMar>
+          </w:tcPr>
+          <w:p>
+            <w:pPr>
+              <w:spacing w:after="0"/>
+            </w:pPr>
+            <w:r>
+              <w:rPr>
+                <w:b/>
+                <w:bCs/>
+                <w:color w:val="FFFFFF"/>
+                <w:sz w:val="17"/>
+                <w:szCs w:val="17"/>
+              </w:rPr>
+              <w:t xml:space="preserve">Fix</w:t>
+            </w:r>
+          </w:p>
+        </w:tc>
+      </w:tr>
+      <w:tr>
+        <w:trPr>
+          <w:cantSplit/>
+        </w:trPr>
+        <w:tc>
+          <w:tcPr>
+            <w:tcW w:type="dxa" w:w="5051"/>
+            <w:tcBorders>
+              <w:top w:val="single" w:color="BFBFBF" w:sz="4"/>
+              <w:left w:val="single" w:color="BFBFBF" w:sz="4"/>
+              <w:bottom w:val="single" w:color="BFBFBF" w:sz="4"/>
+              <w:right w:val="single" w:color="BFBFBF" w:sz="4"/>
+            </w:tcBorders>
+            <w:tcMar>
+              <w:top w:type="dxa" w:w="50"/>
+              <w:left w:type="dxa" w:w="80"/>
+              <w:bottom w:type="dxa" w:w="50"/>
+              <w:right w:type="dxa" w:w="80"/>
+            </w:tcMar>
+          </w:tcPr>
+          <w:p>
+            <w:pPr>
+              <w:spacing w:after="0"/>
+            </w:pPr>
+            <w:r>
+              <w:rPr>
+                <w:b w:val="false"/>
+                <w:bCs w:val="false"/>
+                <w:sz w:val="17"/>
+                <w:szCs w:val="17"/>
+              </w:rPr>
+              <w:t xml:space="preserve">15 API names ended in </w:t>
+            </w:r>
+            <w:r>
+              <w:rPr>
+                <w:rFonts w:ascii="Consolas" w:cs="Consolas" w:eastAsia="Consolas" w:hAnsi="Consolas"/>
+                <w:b w:val="false"/>
+                <w:bCs w:val="false"/>
+                <w:sz w:val="16"/>
+                <w:szCs w:val="16"/>
+                <w:shd w:fill="EEF0F3" w:color="auto" w:val="clear"/>
+              </w:rPr>
+              <w:t xml:space="preserve">_c__c</w:t>
+            </w:r>
+            <w:r>
+              <w:rPr>
+                <w:b w:val="false"/>
+                <w:bCs w:val="false"/>
+                <w:sz w:val="17"/>
+                <w:szCs w:val="17"/>
+              </w:rPr>
+              <w:t xml:space="preserve"> (label typed as </w:t>
+            </w:r>
+            <w:r>
+              <w:rPr>
+                <w:rFonts w:ascii="Consolas" w:cs="Consolas" w:eastAsia="Consolas" w:hAnsi="Consolas"/>
+                <w:b w:val="false"/>
+                <w:bCs w:val="false"/>
+                <w:sz w:val="16"/>
+                <w:szCs w:val="16"/>
+                <w:shd w:fill="EEF0F3" w:color="auto" w:val="clear"/>
+              </w:rPr>
+              <w:t xml:space="preserve">Name__c</w:t>
+            </w:r>
+            <w:r>
+              <w:rPr>
+                <w:b w:val="false"/>
+                <w:bCs w:val="false"/>
+                <w:sz w:val="17"/>
+                <w:szCs w:val="17"/>
+              </w:rPr>
+              <w:t xml:space="preserve">), one was </w:t>
+            </w:r>
+            <w:r>
+              <w:rPr>
+                <w:rFonts w:ascii="Consolas" w:cs="Consolas" w:eastAsia="Consolas" w:hAnsi="Consolas"/>
+                <w:b w:val="false"/>
+                <w:bCs w:val="false"/>
+                <w:sz w:val="16"/>
+                <w:szCs w:val="16"/>
+                <w:shd w:fill="EEF0F3" w:color="auto" w:val="clear"/>
+              </w:rPr>
+              <w:t xml:space="preserve">PurchasePrice__c</w:t>
+            </w:r>
+            <w:r>
+              <w:rPr>
+                <w:b w:val="false"/>
+                <w:bCs w:val="false"/>
+                <w:sz w:val="17"/>
+                <w:szCs w:val="17"/>
+              </w:rPr>
+              <w:t xml:space="preserve">, one lookup was </w:t>
+            </w:r>
+            <w:r>
+              <w:rPr>
+                <w:rFonts w:ascii="Consolas" w:cs="Consolas" w:eastAsia="Consolas" w:hAnsi="Consolas"/>
+                <w:b w:val="false"/>
+                <w:bCs w:val="false"/>
+                <w:sz w:val="16"/>
+                <w:szCs w:val="16"/>
+                <w:shd w:fill="EEF0F3" w:color="auto" w:val="clear"/>
+              </w:rPr>
+              <w:t xml:space="preserve">Contact__c</w:t>
+            </w:r>
+            <w:r>
+              <w:rPr>
+                <w:b w:val="false"/>
+                <w:bCs w:val="false"/>
+                <w:sz w:val="17"/>
+                <w:szCs w:val="17"/>
+              </w:rPr>
+              <w:t xml:space="preserve"> instead of </w:t>
+            </w:r>
+            <w:r>
+              <w:rPr>
+                <w:rFonts w:ascii="Consolas" w:cs="Consolas" w:eastAsia="Consolas" w:hAnsi="Consolas"/>
+                <w:b w:val="false"/>
+                <w:bCs w:val="false"/>
+                <w:sz w:val="16"/>
+                <w:szCs w:val="16"/>
+                <w:shd w:fill="EEF0F3" w:color="auto" w:val="clear"/>
+              </w:rPr>
+              <w:t xml:space="preserve">Borrower__c</w:t>
+            </w:r>
+          </w:p>
+        </w:tc>
+        <w:tc>
+          <w:tcPr>
+            <w:tcW w:type="dxa" w:w="5029"/>
+            <w:tcBorders>
+              <w:top w:val="single" w:color="BFBFBF" w:sz="4"/>
+              <w:left w:val="single" w:color="BFBFBF" w:sz="4"/>
+              <w:bottom w:val="single" w:color="BFBFBF" w:sz="4"/>
+              <w:right w:val="single" w:color="BFBFBF" w:sz="4"/>
+            </w:tcBorders>
+            <w:tcMar>
+              <w:top w:type="dxa" w:w="50"/>
+              <w:left w:type="dxa" w:w="80"/>
+              <w:bottom w:type="dxa" w:w="50"/>
+              <w:right w:type="dxa" w:w="80"/>
+            </w:tcMar>
+          </w:tcPr>
+          <w:p>
+            <w:pPr>
+              <w:spacing w:after="0"/>
+            </w:pPr>
+            <w:r>
+              <w:rPr>
+                <w:b w:val="false"/>
+                <w:bCs w:val="false"/>
+                <w:sz w:val="17"/>
+                <w:szCs w:val="17"/>
+              </w:rPr>
+              <w:t xml:space="preserve">Correct fields deployed; LTV formula and two roll-ups repointed; old fields listed in </w:t>
+            </w:r>
+            <w:r>
+              <w:rPr>
+                <w:rFonts w:ascii="Consolas" w:cs="Consolas" w:eastAsia="Consolas" w:hAnsi="Consolas"/>
+                <w:b w:val="false"/>
+                <w:bCs w:val="false"/>
+                <w:sz w:val="16"/>
+                <w:szCs w:val="16"/>
+                <w:shd w:fill="EEF0F3" w:color="auto" w:val="clear"/>
+              </w:rPr>
+              <w:t xml:space="preserve">fixes/fix-01/manifest/destructiveChanges.xml</w:t>
+            </w:r>
+            <w:r>
+              <w:rPr>
+                <w:b w:val="false"/>
+                <w:bCs w:val="false"/>
+                <w:sz w:val="17"/>
+                <w:szCs w:val="17"/>
+              </w:rPr>
+              <w:t xml:space="preserve"> (no records held data)</w:t>
+            </w:r>
+          </w:p>
+        </w:tc>
+      </w:tr>
+      <w:tr>
+        <w:trPr>
+          <w:cantSplit/>
+        </w:trPr>
+        <w:tc>
+          <w:tcPr>
+            <w:tcW w:type="dxa" w:w="5051"/>
+            <w:tcBorders>
+              <w:top w:val="single" w:color="BFBFBF" w:sz="4"/>
+              <w:left w:val="single" w:color="BFBFBF" w:sz="4"/>
+              <w:bottom w:val="single" w:color="BFBFBF" w:sz="4"/>
+              <w:right w:val="single" w:color="BFBFBF" w:sz="4"/>
+            </w:tcBorders>
+            <w:tcMar>
+              <w:top w:type="dxa" w:w="50"/>
+              <w:left w:type="dxa" w:w="80"/>
+              <w:bottom w:type="dxa" w:w="50"/>
+              <w:right w:type="dxa" w:w="80"/>
+            </w:tcMar>
+          </w:tcPr>
+          <w:p>
+            <w:pPr>
+              <w:spacing w:after="0"/>
+            </w:pPr>
+            <w:r>
+              <w:rPr>
+                <w:b w:val="false"/>
+                <w:bCs w:val="false"/>
+                <w:sz w:val="17"/>
+                <w:szCs w:val="17"/>
+              </w:rPr>
+              <w:t xml:space="preserve">Record names were Text, with separate auto-number fields beside them</w:t>
+            </w:r>
+          </w:p>
+        </w:tc>
+        <w:tc>
+          <w:tcPr>
+            <w:tcW w:type="dxa" w:w="5029"/>
+            <w:tcBorders>
+              <w:top w:val="single" w:color="BFBFBF" w:sz="4"/>
+              <w:left w:val="single" w:color="BFBFBF" w:sz="4"/>
+              <w:bottom w:val="single" w:color="BFBFBF" w:sz="4"/>
+              <w:right w:val="single" w:color="BFBFBF" w:sz="4"/>
+            </w:tcBorders>
+            <w:tcMar>
+              <w:top w:type="dxa" w:w="50"/>
+              <w:left w:type="dxa" w:w="80"/>
+              <w:bottom w:type="dxa" w:w="50"/>
+              <w:right w:type="dxa" w:w="80"/>
+            </w:tcMar>
+          </w:tcPr>
+          <w:p>
+            <w:pPr>
+              <w:spacing w:after="0"/>
+            </w:pPr>
+            <w:r>
+              <w:rPr>
+                <w:b w:val="false"/>
+                <w:bCs w:val="false"/>
+                <w:sz w:val="17"/>
+                <w:szCs w:val="17"/>
+              </w:rPr>
+              <w:t xml:space="preserve">Name fields switched to Auto Number by deploy; the extra fields listed for deletion</w:t>
+            </w:r>
+          </w:p>
+        </w:tc>
+      </w:tr>
+      <w:tr>
+        <w:trPr>
+          <w:cantSplit/>
+        </w:trPr>
+        <w:tc>
+          <w:tcPr>
+            <w:tcW w:type="dxa" w:w="5051"/>
+            <w:tcBorders>
+              <w:top w:val="single" w:color="BFBFBF" w:sz="4"/>
+              <w:left w:val="single" w:color="BFBFBF" w:sz="4"/>
+              <w:bottom w:val="single" w:color="BFBFBF" w:sz="4"/>
+              <w:right w:val="single" w:color="BFBFBF" w:sz="4"/>
+            </w:tcBorders>
+            <w:tcMar>
+              <w:top w:type="dxa" w:w="50"/>
+              <w:left w:type="dxa" w:w="80"/>
+              <w:bottom w:type="dxa" w:w="50"/>
+              <w:right w:type="dxa" w:w="80"/>
+            </w:tcMar>
+          </w:tcPr>
+          <w:p>
+            <w:pPr>
+              <w:spacing w:after="0"/>
+            </w:pPr>
+            <w:r>
+              <w:rPr>
+                <w:b w:val="false"/>
+                <w:bCs w:val="false"/>
+                <w:sz w:val="17"/>
+                <w:szCs w:val="17"/>
+              </w:rPr>
+              <w:t xml:space="preserve">Five Case support processes, no Case record types</w:t>
+            </w:r>
+          </w:p>
+        </w:tc>
+        <w:tc>
+          <w:tcPr>
+            <w:tcW w:type="dxa" w:w="5029"/>
+            <w:tcBorders>
+              <w:top w:val="single" w:color="BFBFBF" w:sz="4"/>
+              <w:left w:val="single" w:color="BFBFBF" w:sz="4"/>
+              <w:bottom w:val="single" w:color="BFBFBF" w:sz="4"/>
+              <w:right w:val="single" w:color="BFBFBF" w:sz="4"/>
+            </w:tcBorders>
+            <w:tcMar>
+              <w:top w:type="dxa" w:w="50"/>
+              <w:left w:type="dxa" w:w="80"/>
+              <w:bottom w:type="dxa" w:w="50"/>
+              <w:right w:type="dxa" w:w="80"/>
+            </w:tcMar>
+          </w:tcPr>
+          <w:p>
+            <w:pPr>
+              <w:spacing w:after="0"/>
+            </w:pPr>
+            <w:r>
+              <w:rPr>
+                <w:b w:val="false"/>
+                <w:bCs w:val="false"/>
+                <w:sz w:val="17"/>
+                <w:szCs w:val="17"/>
+              </w:rPr>
+              <w:t xml:space="preserve">Four record types on </w:t>
+            </w:r>
+            <w:r>
+              <w:rPr>
+                <w:rFonts w:ascii="Consolas" w:cs="Consolas" w:eastAsia="Consolas" w:hAnsi="Consolas"/>
+                <w:b w:val="false"/>
+                <w:bCs w:val="false"/>
+                <w:sz w:val="16"/>
+                <w:szCs w:val="16"/>
+                <w:shd w:fill="EEF0F3" w:color="auto" w:val="clear"/>
+              </w:rPr>
+              <w:t xml:space="preserve">Borrower Service</w:t>
+            </w:r>
+            <w:r>
+              <w:rPr>
+                <w:b w:val="false"/>
+                <w:bCs w:val="false"/>
+                <w:sz w:val="17"/>
+                <w:szCs w:val="17"/>
+              </w:rPr>
+              <w:t xml:space="preserve">; the other four support processes deactivated</w:t>
+            </w:r>
+          </w:p>
+        </w:tc>
+      </w:tr>
+      <w:tr>
+        <w:trPr>
+          <w:cantSplit/>
+        </w:trPr>
+        <w:tc>
+          <w:tcPr>
+            <w:tcW w:type="dxa" w:w="5051"/>
+            <w:tcBorders>
+              <w:top w:val="single" w:color="BFBFBF" w:sz="4"/>
+              <w:left w:val="single" w:color="BFBFBF" w:sz="4"/>
+              <w:bottom w:val="single" w:color="BFBFBF" w:sz="4"/>
+              <w:right w:val="single" w:color="BFBFBF" w:sz="4"/>
+            </w:tcBorders>
+            <w:tcMar>
+              <w:top w:type="dxa" w:w="50"/>
+              <w:left w:type="dxa" w:w="80"/>
+              <w:bottom w:type="dxa" w:w="50"/>
+              <w:right w:type="dxa" w:w="80"/>
+            </w:tcMar>
+          </w:tcPr>
+          <w:p>
+            <w:pPr>
+              <w:spacing w:after="0"/>
+            </w:pPr>
+            <w:r>
+              <w:rPr>
+                <w:rFonts w:ascii="Consolas" w:cs="Consolas" w:eastAsia="Consolas" w:hAnsi="Consolas"/>
+                <w:b w:val="false"/>
+                <w:bCs w:val="false"/>
+                <w:sz w:val="16"/>
+                <w:szCs w:val="16"/>
+                <w:shd w:fill="EEF0F3" w:color="auto" w:val="clear"/>
+              </w:rPr>
+              <w:t xml:space="preserve">Account.Core_Household_Id__c</w:t>
+            </w:r>
+            <w:r>
+              <w:rPr>
+                <w:b w:val="false"/>
+                <w:bCs w:val="false"/>
+                <w:sz w:val="17"/>
+                <w:szCs w:val="17"/>
+              </w:rPr>
+              <w:t xml:space="preserve"> missing</w:t>
+            </w:r>
+          </w:p>
+        </w:tc>
+        <w:tc>
+          <w:tcPr>
+            <w:tcW w:type="dxa" w:w="5029"/>
+            <w:tcBorders>
+              <w:top w:val="single" w:color="BFBFBF" w:sz="4"/>
+              <w:left w:val="single" w:color="BFBFBF" w:sz="4"/>
+              <w:bottom w:val="single" w:color="BFBFBF" w:sz="4"/>
+              <w:right w:val="single" w:color="BFBFBF" w:sz="4"/>
+            </w:tcBorders>
+            <w:tcMar>
+              <w:top w:type="dxa" w:w="50"/>
+              <w:left w:type="dxa" w:w="80"/>
+              <w:bottom w:type="dxa" w:w="50"/>
+              <w:right w:type="dxa" w:w="80"/>
+            </w:tcMar>
+          </w:tcPr>
+          <w:p>
+            <w:pPr>
+              <w:spacing w:after="0"/>
+            </w:pPr>
+            <w:r>
+              <w:rPr>
+                <w:b w:val="false"/>
+                <w:bCs w:val="false"/>
+                <w:sz w:val="17"/>
+                <w:szCs w:val="17"/>
+              </w:rPr>
+              <w:t xml:space="preserve">Deployed</w:t>
+            </w:r>
+          </w:p>
+        </w:tc>
+      </w:tr>
+      <w:tr>
+        <w:trPr>
+          <w:cantSplit/>
+        </w:trPr>
+        <w:tc>
+          <w:tcPr>
+            <w:tcW w:type="dxa" w:w="5051"/>
+            <w:tcBorders>
+              <w:top w:val="single" w:color="BFBFBF" w:sz="4"/>
+              <w:left w:val="single" w:color="BFBFBF" w:sz="4"/>
+              <w:bottom w:val="single" w:color="BFBFBF" w:sz="4"/>
+              <w:right w:val="single" w:color="BFBFBF" w:sz="4"/>
+            </w:tcBorders>
+            <w:tcMar>
+              <w:top w:type="dxa" w:w="50"/>
+              <w:left w:type="dxa" w:w="80"/>
+              <w:bottom w:type="dxa" w:w="50"/>
+              <w:right w:type="dxa" w:w="80"/>
+            </w:tcMar>
+          </w:tcPr>
+          <w:p>
+            <w:pPr>
+              <w:spacing w:after="0"/>
+            </w:pPr>
+            <w:r>
+              <w:rPr>
+                <w:b w:val="false"/>
+                <w:bCs w:val="false"/>
+                <w:sz w:val="17"/>
+                <w:szCs w:val="17"/>
+              </w:rPr>
+              <w:t xml:space="preserve">Generator bug: </w:t>
+            </w:r>
+            <w:r>
+              <w:rPr>
+                <w:rFonts w:ascii="Consolas" w:cs="Consolas" w:eastAsia="Consolas" w:hAnsi="Consolas"/>
+                <w:b w:val="false"/>
+                <w:bCs w:val="false"/>
+                <w:sz w:val="16"/>
+                <w:szCs w:val="16"/>
+                <w:shd w:fill="EEF0F3" w:color="auto" w:val="clear"/>
+              </w:rPr>
+              <w:t xml:space="preserve">Apex_Data_Model_2</w:t>
+            </w:r>
+            <w:r>
+              <w:rPr>
+                <w:b w:val="false"/>
+                <w:bCs w:val="false"/>
+                <w:sz w:val="17"/>
+                <w:szCs w:val="17"/>
+              </w:rPr>
+              <w:t xml:space="preserve"> granted Read on master-detail children without Read on Opportunity, so the deploy failed</w:t>
+            </w:r>
+          </w:p>
+        </w:tc>
+        <w:tc>
+          <w:tcPr>
+            <w:tcW w:type="dxa" w:w="5029"/>
+            <w:tcBorders>
+              <w:top w:val="single" w:color="BFBFBF" w:sz="4"/>
+              <w:left w:val="single" w:color="BFBFBF" w:sz="4"/>
+              <w:bottom w:val="single" w:color="BFBFBF" w:sz="4"/>
+              <w:right w:val="single" w:color="BFBFBF" w:sz="4"/>
+            </w:tcBorders>
+            <w:tcMar>
+              <w:top w:type="dxa" w:w="50"/>
+              <w:left w:type="dxa" w:w="80"/>
+              <w:bottom w:type="dxa" w:w="50"/>
+              <w:right w:type="dxa" w:w="80"/>
+            </w:tcMar>
+          </w:tcPr>
+          <w:p>
+            <w:pPr>
+              <w:spacing w:after="0"/>
+            </w:pPr>
+            <w:r>
+              <w:rPr>
+                <w:rFonts w:ascii="Consolas" w:cs="Consolas" w:eastAsia="Consolas" w:hAnsi="Consolas"/>
+                <w:b w:val="false"/>
+                <w:bCs w:val="false"/>
+                <w:sz w:val="16"/>
+                <w:szCs w:val="16"/>
+                <w:shd w:fill="EEF0F3" w:color="auto" w:val="clear"/>
+              </w:rPr>
+              <w:t xml:space="preserve">datamodel.py</w:t>
+            </w:r>
+            <w:r>
+              <w:rPr>
+                <w:b w:val="false"/>
+                <w:bCs w:val="false"/>
+                <w:sz w:val="17"/>
+                <w:szCs w:val="17"/>
+              </w:rPr>
+              <w:t xml:space="preserve"> now adds read-only parent permissions; package regenerated</w:t>
+            </w:r>
+          </w:p>
+        </w:tc>
+      </w:tr>
+      <w:tr>
+        <w:trPr>
+          <w:cantSplit/>
+        </w:trPr>
+        <w:tc>
+          <w:tcPr>
+            <w:tcW w:type="dxa" w:w="5051"/>
+            <w:tcBorders>
+              <w:top w:val="single" w:color="BFBFBF" w:sz="4"/>
+              <w:left w:val="single" w:color="BFBFBF" w:sz="4"/>
+              <w:bottom w:val="single" w:color="BFBFBF" w:sz="4"/>
+              <w:right w:val="single" w:color="BFBFBF" w:sz="4"/>
+            </w:tcBorders>
+            <w:tcMar>
+              <w:top w:type="dxa" w:w="50"/>
+              <w:left w:type="dxa" w:w="80"/>
+              <w:bottom w:type="dxa" w:w="50"/>
+              <w:right w:type="dxa" w:w="80"/>
+            </w:tcMar>
+          </w:tcPr>
+          <w:p>
+            <w:pPr>
+              <w:spacing w:after="0"/>
+            </w:pPr>
+            <w:r>
+              <w:rPr>
+                <w:b w:val="false"/>
+                <w:bCs w:val="false"/>
+                <w:sz w:val="17"/>
+                <w:szCs w:val="17"/>
+              </w:rPr>
+              <w:t xml:space="preserve">Guide gap: nothing warned about label vs field name, record name vs auto-number field, support process vs record type</w:t>
+            </w:r>
+          </w:p>
+        </w:tc>
+        <w:tc>
+          <w:tcPr>
+            <w:tcW w:type="dxa" w:w="5029"/>
+            <w:tcBorders>
+              <w:top w:val="single" w:color="BFBFBF" w:sz="4"/>
+              <w:left w:val="single" w:color="BFBFBF" w:sz="4"/>
+              <w:bottom w:val="single" w:color="BFBFBF" w:sz="4"/>
+              <w:right w:val="single" w:color="BFBFBF" w:sz="4"/>
+            </w:tcBorders>
+            <w:tcMar>
+              <w:top w:type="dxa" w:w="50"/>
+              <w:left w:type="dxa" w:w="80"/>
+              <w:bottom w:type="dxa" w:w="50"/>
+              <w:right w:type="dxa" w:w="80"/>
+            </w:tcMar>
+          </w:tcPr>
+          <w:p>
+            <w:pPr>
+              <w:spacing w:after="0"/>
+            </w:pPr>
+            <w:r>
+              <w:rPr>
+                <w:b w:val="false"/>
+                <w:bCs w:val="false"/>
+                <w:sz w:val="17"/>
+                <w:szCs w:val="17"/>
+              </w:rPr>
+              <w:t xml:space="preserve">Project 03 §0.3 now has a "Three slips" callout and a "Check your build" step</w:t>
+            </w:r>
+          </w:p>
+        </w:tc>
+      </w:tr>
+    </w:tbl>
+    <w:p>
+      <w:pPr>
+        <w:spacing w:after="120"/>
+      </w:pPr>
+    </w:p>
+    <w:p>
+      <w:pPr>
+        <w:spacing w:after="120"/>
+      </w:pPr>
+      <w:r>
+        <w:t xml:space="preserve">Still open in the org (guide steps not yet reached or small setting differences): </w:t>
+      </w:r>
+      <w:r>
+        <w:rPr>
+          <w:rFonts w:ascii="Consolas" w:cs="Consolas" w:eastAsia="Consolas" w:hAnsi="Consolas"/>
+          <w:sz w:val="19"/>
+          <w:szCs w:val="19"/>
+          <w:shd w:fill="EEF0F3" w:color="auto" w:val="clear"/>
+        </w:rPr>
+        <w:t xml:space="preserve">Street__c</w:t>
+      </w:r>
+      <w:r>
+        <w:t xml:space="preserve"> and </w:t>
+      </w:r>
+      <w:r>
+        <w:rPr>
+          <w:rFonts w:ascii="Consolas" w:cs="Consolas" w:eastAsia="Consolas" w:hAnsi="Consolas"/>
+          <w:sz w:val="19"/>
+          <w:szCs w:val="19"/>
+          <w:shd w:fill="EEF0F3" w:color="auto" w:val="clear"/>
+        </w:rPr>
+        <w:t xml:space="preserve">City__c</w:t>
+      </w:r>
+      <w:r>
+        <w:t xml:space="preserve"> length 20, </w:t>
+      </w:r>
+      <w:r>
+        <w:rPr>
+          <w:rFonts w:ascii="Consolas" w:cs="Consolas" w:eastAsia="Consolas" w:hAnsi="Consolas"/>
+          <w:sz w:val="19"/>
+          <w:szCs w:val="19"/>
+          <w:shd w:fill="EEF0F3" w:color="auto" w:val="clear"/>
+        </w:rPr>
+        <w:t xml:space="preserve">Remaining_Amortization_Years__c</w:t>
+      </w:r>
+      <w:r>
+        <w:t xml:space="preserve"> scale, </w:t>
+      </w:r>
+      <w:r>
+        <w:rPr>
+          <w:rFonts w:ascii="Consolas" w:cs="Consolas" w:eastAsia="Consolas" w:hAnsi="Consolas"/>
+          <w:sz w:val="19"/>
+          <w:szCs w:val="19"/>
+          <w:shd w:fill="EEF0F3" w:color="auto" w:val="clear"/>
+        </w:rPr>
+        <w:t xml:space="preserve">Unified_Individual_Id__c</w:t>
+      </w:r>
+      <w:r>
+        <w:t xml:space="preserve"> length, picklist defaults on Approval Request Status, Condition Status and Property Occupancy, history tracking on Condition, OWD still Public Read/Write.</w:t>
+      </w:r>
     </w:p>
     <w:sectPr>
       <w:headerReference w:type="default" r:id="rId7"/>

</xml_diff>